<commit_message>
feat(traducciones): modulo de Traducciones ENAGO con control de paquete prepagado
- Nuevo modulo /traducciones (lider: Fernando Penaranda): encargos, deposito prepagado, saldo, extracto y cierre anual filtrable por ano

- Historico ENAGO + datos academicos del registro interno (investigador, articulo, revista, cuartil, facultad)

- Informe IA de Traducciones y reintento ante fallas de red en /api/ai-report

- Ajustes en certificados, plantillas, libros, sidebar y permisos

- .gitignore: excluir archivos de datos fuente de la raiz
</commit_message>
<xml_diff>
--- a/public/templates/AVAL-CAP-DIVULGACION.docx
+++ b/public/templates/AVAL-CAP-DIVULGACION.docx
@@ -952,47 +952,7 @@
           <w:sz w:val="22"/>
           <w:szCs w:val="22"/>
         </w:rPr>
-        <w:t xml:space="preserve">La siguiente constancia se expide a los </w:t>
-      </w:r>
-      <w:r>
-        <w:rPr>
-          <w:rFonts w:ascii="Roboto" w:hAnsi="Roboto"/>
-          <w:sz w:val="22"/>
-          <w:szCs w:val="22"/>
-        </w:rPr>
-        <w:t>18</w:t>
-      </w:r>
-      <w:r>
-        <w:rPr>
-          <w:rFonts w:ascii="Roboto" w:hAnsi="Roboto"/>
-          <w:sz w:val="22"/>
-          <w:szCs w:val="22"/>
-        </w:rPr>
-        <w:t xml:space="preserve"> días del mes </w:t>
-      </w:r>
-      <w:r>
-        <w:rPr>
-          <w:rFonts w:ascii="Roboto" w:hAnsi="Roboto"/>
-          <w:sz w:val="22"/>
-          <w:szCs w:val="22"/>
-        </w:rPr>
-        <w:t>de octubre</w:t>
-      </w:r>
-      <w:r>
-        <w:rPr>
-          <w:rFonts w:ascii="Roboto" w:hAnsi="Roboto"/>
-          <w:sz w:val="22"/>
-          <w:szCs w:val="22"/>
-        </w:rPr>
-        <w:t xml:space="preserve"> del año 202</w:t>
-      </w:r>
-      <w:r>
-        <w:rPr>
-          <w:rFonts w:ascii="Roboto" w:hAnsi="Roboto"/>
-          <w:sz w:val="22"/>
-          <w:szCs w:val="22"/>
-        </w:rPr>
-        <w:t>4</w:t>
+        <w:t xml:space="preserve">La siguiente constancia se expide a los {dia_expedicion} días del mes de {mes_expedicion} del año {anio_expedicion}.</w:t>
       </w:r>
       <w:r>
         <w:rPr>
@@ -1226,75 +1186,6 @@
     <w:pPr>
       <w:pStyle w:val="Piedepgina"/>
     </w:pPr>
-    <w:r>
-      <w:rPr>
-        <w:noProof/>
-        <w:bdr w:val="none" w:sz="0" w:space="0" w:color="auto" w:frame="1"/>
-        <w:lang w:val="es-CO" w:eastAsia="es-CO"/>
-      </w:rPr>
-      <w:drawing>
-        <wp:anchor distT="0" distB="0" distL="114300" distR="114300" simplePos="0" relativeHeight="251659264" behindDoc="0" locked="0" layoutInCell="1" allowOverlap="1" wp14:anchorId="5DC4253A" wp14:editId="395C2714">
-          <wp:simplePos x="0" y="0"/>
-          <wp:positionH relativeFrom="column">
-            <wp:posOffset>-354408</wp:posOffset>
-          </wp:positionH>
-          <wp:positionV relativeFrom="paragraph">
-            <wp:posOffset>-341840</wp:posOffset>
-          </wp:positionV>
-          <wp:extent cx="6352878" cy="782424"/>
-          <wp:effectExtent l="0" t="0" r="0" b="0"/>
-          <wp:wrapNone/>
-          <wp:docPr id="7" name="Imagen 7" descr="https://lh6.googleusercontent.com/E9LOjTfUWiPrN6HoM6E5Ld9BrCEVlhmjMFvQE1j41PFT8KBPZqIVbyICge6uo8EP_2NVt9gcckI5BFxrvMQT1e7dqPFjYQXdWLua7XIEhelLIEeGggYEIvwkcfbWo0l9Xp_Fy8M"/>
-          <wp:cNvGraphicFramePr>
-            <a:graphicFrameLocks xmlns:a="http://schemas.openxmlformats.org/drawingml/2006/main" noChangeAspect="1"/>
-          </wp:cNvGraphicFramePr>
-          <a:graphic xmlns:a="http://schemas.openxmlformats.org/drawingml/2006/main">
-            <a:graphicData uri="http://schemas.openxmlformats.org/drawingml/2006/picture">
-              <pic:pic xmlns:pic="http://schemas.openxmlformats.org/drawingml/2006/picture">
-                <pic:nvPicPr>
-                  <pic:cNvPr id="0" name="Picture 5" descr="https://lh6.googleusercontent.com/E9LOjTfUWiPrN6HoM6E5Ld9BrCEVlhmjMFvQE1j41PFT8KBPZqIVbyICge6uo8EP_2NVt9gcckI5BFxrvMQT1e7dqPFjYQXdWLua7XIEhelLIEeGggYEIvwkcfbWo0l9Xp_Fy8M"/>
-                  <pic:cNvPicPr>
-                    <a:picLocks noChangeAspect="1" noChangeArrowheads="1"/>
-                  </pic:cNvPicPr>
-                </pic:nvPicPr>
-                <pic:blipFill>
-                  <a:blip r:embed="rId1" cstate="print">
-                    <a:extLst>
-                      <a:ext uri="{28A0092B-C50C-407E-A947-70E740481C1C}">
-                        <a14:useLocalDpi xmlns:a14="http://schemas.microsoft.com/office/drawing/2010/main" val="0"/>
-                      </a:ext>
-                    </a:extLst>
-                  </a:blip>
-                  <a:srcRect/>
-                  <a:stretch>
-                    <a:fillRect/>
-                  </a:stretch>
-                </pic:blipFill>
-                <pic:spPr bwMode="auto">
-                  <a:xfrm>
-                    <a:off x="0" y="0"/>
-                    <a:ext cx="6352878" cy="782424"/>
-                  </a:xfrm>
-                  <a:prstGeom prst="rect">
-                    <a:avLst/>
-                  </a:prstGeom>
-                  <a:noFill/>
-                  <a:ln>
-                    <a:noFill/>
-                  </a:ln>
-                </pic:spPr>
-              </pic:pic>
-            </a:graphicData>
-          </a:graphic>
-          <wp14:sizeRelH relativeFrom="page">
-            <wp14:pctWidth>0</wp14:pctWidth>
-          </wp14:sizeRelH>
-          <wp14:sizeRelV relativeFrom="page">
-            <wp14:pctHeight>0</wp14:pctHeight>
-          </wp14:sizeRelV>
-        </wp:anchor>
-      </w:drawing>
-    </w:r>
   </w:p>
 </w:ftr>
 </file>

</xml_diff>